<commit_message>
Fix R console messages leaking into the example manuscript
The template's index.qmd setup-results chunk (library(tidyverse) +
read_csv()) had #| echo: false but not message/warning suppression, so
the tidyverse attach banner and readr's column-spec message were
rendering straight into the Results section of the PDF/HTML/DOCX
example — right where an actual result should be.

Fixed at the project level in the template's _quarto.yml (execute:
warning: false, message: false) rather than just this one chunk, so it
protects any chunk someone adds later too. Regenerated all four
downloads (pdf, html, docx, zip) from a clean render; verified the
Results section is now just the actual figure/table.
</commit_message>
<xml_diff>
--- a/downloads/example-manuscript.docx
+++ b/downloads/example-manuscript.docx
@@ -23,10 +23,10 @@
         <w:pStyle w:val="Date"/>
       </w:pPr>
       <w:r>
-        <w:t xml:space="preserve">2026-07-24</w:t>
-      </w:r>
-    </w:p>
-    <w:bookmarkStart w:id="20" w:name="abstract"/>
+        <w:t xml:space="preserve">2026-07-27</w:t>
+      </w:r>
+    </w:p>
+    <w:bookmarkStart w:id="9" w:name="abstract"/>
     <w:p>
       <w:pPr>
         <w:pStyle w:val="Heading2"/>
@@ -43,8 +43,8 @@
         <w:t xml:space="preserve">FILL IN — 150–250 words summarising the question, approach, and key finding.</w:t>
       </w:r>
     </w:p>
-    <w:bookmarkEnd w:id="20"/>
-    <w:bookmarkStart w:id="21" w:name="introduction"/>
+    <w:bookmarkEnd w:id="9"/>
+    <w:bookmarkStart w:id="10" w:name="introduction"/>
     <w:p>
       <w:pPr>
         <w:pStyle w:val="Heading2"/>
@@ -103,8 +103,8 @@
         <w:t xml:space="preserve">.</w:t>
       </w:r>
     </w:p>
-    <w:bookmarkEnd w:id="21"/>
-    <w:bookmarkStart w:id="24" w:name="methods"/>
+    <w:bookmarkEnd w:id="10"/>
+    <w:bookmarkStart w:id="13" w:name="methods"/>
     <w:p>
       <w:pPr>
         <w:pStyle w:val="Heading2"/>
@@ -113,7 +113,7 @@
         <w:t xml:space="preserve">Methods</w:t>
       </w:r>
     </w:p>
-    <w:bookmarkStart w:id="22" w:name="study-design"/>
+    <w:bookmarkStart w:id="11" w:name="study-design"/>
     <w:p>
       <w:pPr>
         <w:pStyle w:val="Heading3"/>
@@ -130,8 +130,8 @@
         <w:t xml:space="preserve">FILL IN.</w:t>
       </w:r>
     </w:p>
-    <w:bookmarkEnd w:id="22"/>
-    <w:bookmarkStart w:id="23" w:name="statistical-analysis"/>
+    <w:bookmarkEnd w:id="11"/>
+    <w:bookmarkStart w:id="12" w:name="statistical-analysis"/>
     <w:p>
       <w:pPr>
         <w:pStyle w:val="Heading3"/>
@@ -163,173 +163,15 @@
         <w:t xml:space="preserve">in prose here.</w:t>
       </w:r>
     </w:p>
-    <w:bookmarkEnd w:id="23"/>
-    <w:bookmarkEnd w:id="24"/>
-    <w:bookmarkStart w:id="30" w:name="results"/>
+    <w:bookmarkEnd w:id="12"/>
+    <w:bookmarkEnd w:id="13"/>
+    <w:bookmarkStart w:id="19" w:name="results"/>
     <w:p>
       <w:pPr>
         <w:pStyle w:val="Heading2"/>
       </w:pPr>
       <w:r>
         <w:t xml:space="preserve">Results</w:t>
-      </w:r>
-    </w:p>
-    <w:p>
-      <w:pPr>
-        <w:pStyle w:val="SourceCode"/>
-      </w:pPr>
-      <w:r>
-        <w:rPr>
-          <w:rStyle w:val="VerbatimChar"/>
-        </w:rPr>
-        <w:t xml:space="preserve">── Attaching core tidyverse packages ──────────────────────── tidyverse 2.0.0 ──</w:t>
-      </w:r>
-      <w:r>
-        <w:br/>
-      </w:r>
-      <w:r>
-        <w:rPr>
-          <w:rStyle w:val="VerbatimChar"/>
-        </w:rPr>
-        <w:t xml:space="preserve">✔ dplyr     1.1.4     ✔ readr     2.1.5</w:t>
-      </w:r>
-      <w:r>
-        <w:br/>
-      </w:r>
-      <w:r>
-        <w:rPr>
-          <w:rStyle w:val="VerbatimChar"/>
-        </w:rPr>
-        <w:t xml:space="preserve">✔ forcats   1.0.0     ✔ stringr   1.5.2</w:t>
-      </w:r>
-      <w:r>
-        <w:br/>
-      </w:r>
-      <w:r>
-        <w:rPr>
-          <w:rStyle w:val="VerbatimChar"/>
-        </w:rPr>
-        <w:t xml:space="preserve">✔ ggplot2   4.0.0     ✔ tibble    3.3.0</w:t>
-      </w:r>
-      <w:r>
-        <w:br/>
-      </w:r>
-      <w:r>
-        <w:rPr>
-          <w:rStyle w:val="VerbatimChar"/>
-        </w:rPr>
-        <w:t xml:space="preserve">✔ lubridate 1.9.4     ✔ tidyr     1.3.1</w:t>
-      </w:r>
-      <w:r>
-        <w:br/>
-      </w:r>
-      <w:r>
-        <w:rPr>
-          <w:rStyle w:val="VerbatimChar"/>
-        </w:rPr>
-        <w:t xml:space="preserve">✔ purrr     1.1.0     </w:t>
-      </w:r>
-      <w:r>
-        <w:br/>
-      </w:r>
-      <w:r>
-        <w:rPr>
-          <w:rStyle w:val="VerbatimChar"/>
-        </w:rPr>
-        <w:t xml:space="preserve">── Conflicts ────────────────────────────────────────── tidyverse_conflicts() ──</w:t>
-      </w:r>
-      <w:r>
-        <w:br/>
-      </w:r>
-      <w:r>
-        <w:rPr>
-          <w:rStyle w:val="VerbatimChar"/>
-        </w:rPr>
-        <w:t xml:space="preserve">✖ dplyr::filter() masks stats::filter()</w:t>
-      </w:r>
-      <w:r>
-        <w:br/>
-      </w:r>
-      <w:r>
-        <w:rPr>
-          <w:rStyle w:val="VerbatimChar"/>
-        </w:rPr>
-        <w:t xml:space="preserve">✖ dplyr::lag()    masks stats::lag()</w:t>
-      </w:r>
-      <w:r>
-        <w:br/>
-      </w:r>
-      <w:r>
-        <w:rPr>
-          <w:rStyle w:val="VerbatimChar"/>
-        </w:rPr>
-        <w:t xml:space="preserve">ℹ Use the conflicted package (&lt;http://conflicted.r-lib.org/&gt;) to force all conflicts to become errors</w:t>
-      </w:r>
-      <w:r>
-        <w:br/>
-      </w:r>
-      <w:r>
-        <w:rPr>
-          <w:rStyle w:val="VerbatimChar"/>
-        </w:rPr>
-        <w:t xml:space="preserve">Rows: 2 Columns: 4</w:t>
-      </w:r>
-      <w:r>
-        <w:br/>
-      </w:r>
-      <w:r>
-        <w:rPr>
-          <w:rStyle w:val="VerbatimChar"/>
-        </w:rPr>
-        <w:t xml:space="preserve">── Column specification ────────────────────────────────────────────────────────</w:t>
-      </w:r>
-      <w:r>
-        <w:br/>
-      </w:r>
-      <w:r>
-        <w:rPr>
-          <w:rStyle w:val="VerbatimChar"/>
-        </w:rPr>
-        <w:t xml:space="preserve">Delimiter: ","</w:t>
-      </w:r>
-      <w:r>
-        <w:br/>
-      </w:r>
-      <w:r>
-        <w:rPr>
-          <w:rStyle w:val="VerbatimChar"/>
-        </w:rPr>
-        <w:t xml:space="preserve">chr (1): treatment</w:t>
-      </w:r>
-      <w:r>
-        <w:br/>
-      </w:r>
-      <w:r>
-        <w:rPr>
-          <w:rStyle w:val="VerbatimChar"/>
-        </w:rPr>
-        <w:t xml:space="preserve">dbl (3): n, mean, sd</w:t>
-      </w:r>
-      <w:r>
-        <w:br/>
-      </w:r>
-      <w:r>
-        <w:br/>
-      </w:r>
-      <w:r>
-        <w:rPr>
-          <w:rStyle w:val="VerbatimChar"/>
-        </w:rPr>
-        <w:t xml:space="preserve">ℹ Use `spec()` to retrieve the full column specification for this data.</w:t>
-      </w:r>
-      <w:r>
-        <w:br/>
-      </w:r>
-      <w:r>
-        <w:rPr>
-          <w:rStyle w:val="VerbatimChar"/>
-        </w:rPr>
-        <w:t xml:space="preserve">ℹ Specify the column types or set `show_col_types = FALSE` to quiet this message.</w:t>
       </w:r>
     </w:p>
     <w:p>
@@ -365,7 +207,7 @@
       <w:tr>
         <w:tc>
           <w:tcPr/>
-          <w:bookmarkStart w:id="28" w:name="fig-example"/>
+          <w:bookmarkStart w:id="17" w:name="fig-example"/>
           <w:p>
             <w:pPr>
               <w:pStyle w:val="Compact"/>
@@ -376,18 +218,18 @@
                 <wp:inline>
                   <wp:extent cx="5334000" cy="3810000"/>
                   <wp:effectExtent b="0" l="0" r="0" t="0"/>
-                  <wp:docPr descr="" title="" id="26" name="Picture"/>
+                  <wp:docPr descr="" title="" id="15" name="Picture"/>
                   <a:graphic>
                     <a:graphicData uri="http://schemas.openxmlformats.org/drawingml/2006/picture">
                       <pic:pic>
                         <pic:nvPicPr>
-                          <pic:cNvPr descr="outputs/figures/fig-example.png" id="27" name="Picture"/>
+                          <pic:cNvPr descr="outputs/figures/fig-example.png" id="16" name="Picture"/>
                           <pic:cNvPicPr>
                             <a:picLocks noChangeArrowheads="1" noChangeAspect="1"/>
                           </pic:cNvPicPr>
                         </pic:nvPicPr>
                         <pic:blipFill>
-                          <a:blip r:embed="rId25"/>
+                          <a:blip r:embed="rId14"/>
                           <a:stretch>
                             <a:fillRect/>
                           </a:stretch>
@@ -427,7 +269,7 @@
               <w:t xml:space="preserve">Figure 1: FILL IN — figure caption matching the one in analysis.qmd</w:t>
             </w:r>
           </w:p>
-          <w:bookmarkEnd w:id="28"/>
+          <w:bookmarkEnd w:id="17"/>
         </w:tc>
       </w:tr>
     </w:tbl>
@@ -483,7 +325,7 @@
       <w:tr>
         <w:tc>
           <w:tcPr/>
-          <w:bookmarkStart w:id="29" w:name="tbl-summary-ref"/>
+          <w:bookmarkStart w:id="18" w:name="tbl-summary-ref"/>
           <w:p>
             <w:pPr>
               <w:jc w:val="center"/>
@@ -675,13 +517,13 @@
               </w:tc>
             </w:tr>
           </w:tbl>
-          <w:bookmarkEnd w:id="29"/>
+          <w:bookmarkEnd w:id="18"/>
           <w:p/>
         </w:tc>
       </w:tr>
     </w:tbl>
-    <w:bookmarkEnd w:id="30"/>
-    <w:bookmarkStart w:id="31" w:name="discussion"/>
+    <w:bookmarkEnd w:id="19"/>
+    <w:bookmarkStart w:id="20" w:name="discussion"/>
     <w:p>
       <w:pPr>
         <w:pStyle w:val="Heading2"/>
@@ -698,8 +540,8 @@
         <w:t xml:space="preserve">FILL IN.</w:t>
       </w:r>
     </w:p>
-    <w:bookmarkEnd w:id="31"/>
-    <w:bookmarkStart w:id="32" w:name="data-availability"/>
+    <w:bookmarkEnd w:id="20"/>
+    <w:bookmarkStart w:id="21" w:name="data-availability"/>
     <w:p>
       <w:pPr>
         <w:pStyle w:val="Heading2"/>
@@ -708,8 +550,8 @@
         <w:t xml:space="preserve">Data availability</w:t>
       </w:r>
     </w:p>
-    <w:bookmarkEnd w:id="32"/>
-    <w:bookmarkStart w:id="36" w:name="references"/>
+    <w:bookmarkEnd w:id="21"/>
+    <w:bookmarkStart w:id="25" w:name="references"/>
     <w:p>
       <w:pPr>
         <w:pStyle w:val="Heading2"/>
@@ -718,8 +560,8 @@
         <w:t xml:space="preserve">References</w:t>
       </w:r>
     </w:p>
-    <w:bookmarkStart w:id="35" w:name="refs"/>
-    <w:bookmarkStart w:id="34" w:name="ref-example2024"/>
+    <w:bookmarkStart w:id="24" w:name="refs"/>
+    <w:bookmarkStart w:id="23" w:name="ref-example2024"/>
     <w:p>
       <w:pPr>
         <w:pStyle w:val="Bibliography"/>
@@ -752,7 +594,7 @@
       <w:r>
         <w:t xml:space="preserve"> </w:t>
       </w:r>
-      <w:hyperlink r:id="rId33">
+      <w:hyperlink r:id="rId22">
         <w:r>
           <w:rPr>
             <w:rStyle w:val="Hyperlink"/>
@@ -764,9 +606,9 @@
         <w:t xml:space="preserve">.</w:t>
       </w:r>
     </w:p>
-    <w:bookmarkEnd w:id="34"/>
-    <w:bookmarkEnd w:id="35"/>
-    <w:bookmarkEnd w:id="36"/>
+    <w:bookmarkEnd w:id="23"/>
+    <w:bookmarkEnd w:id="24"/>
+    <w:bookmarkEnd w:id="25"/>
     <w:sectPr>
       <w:footnotePr>
         <w:numRestart w:val="eachSect"/>
@@ -888,10 +730,10 @@
   <w:docDefaults>
     <w:rPrDefault>
       <w:rPr>
-        <w:rFonts w:asciiTheme="minorHAnsi" w:cstheme="minorBidi" w:eastAsiaTheme="minorHAnsi" w:hAnsiTheme="minorHAnsi"/>
+        <w:rFonts w:asciiTheme="minorHAnsi" w:cstheme="minorBidi" w:eastAsiaTheme="minorEastAsia" w:hAnsiTheme="minorHAnsi"/>
         <w:sz w:val="24"/>
         <w:szCs w:val="24"/>
-        <w:lang w:bidi="ar-SA" w:eastAsia="en-US" w:val="en-US"/>
+        <w:lang w:bidi="ar-SA" w:eastAsia="zh-CN" w:val="en-US"/>
       </w:rPr>
     </w:rPrDefault>
     <w:pPrDefault>
@@ -1432,13 +1274,6 @@
       </w:tblCellMar>
     </w:tblPr>
     <w:tblStylePr w:type="firstRow">
-      <w:tblPr>
-        <w:jc w:val="left"/>
-        <w:tblInd w:type="dxa" w:w="0"/>
-      </w:tblPr>
-      <w:trPr>
-        <w:jc w:val="left"/>
-      </w:trPr>
       <w:tcPr>
         <w:tcBorders>
           <w:bottom w:val="single"/>

</xml_diff>